<commit_message>
Complete notes in Qua Song IQ functionality report
</commit_message>
<xml_diff>
--- a/downloads/qua-song-iq/BaoCao_ChucNang_QuaSongIQ.docx
+++ b/downloads/qua-song-iq/BaoCao_ChucNang_QuaSongIQ.docx
@@ -250,8 +250,9 @@
             <w:r>
               <w:rPr>
                 <w:rFonts w:ascii="Times New Roman" w:hAnsi="Times New Roman" w:eastAsia="Times New Roman"/>
-                <w:sz w:val="22"/>
-              </w:rPr>
+                <w:sz w:val="20"/>
+              </w:rPr>
+              <w:t>Hiển thị màn hình chọn màn, tiêu đề và giao diện chính của trò chơi.</w:t>
             </w:r>
           </w:p>
         </w:tc>
@@ -353,8 +354,9 @@
             <w:r>
               <w:rPr>
                 <w:rFonts w:ascii="Times New Roman" w:hAnsi="Times New Roman" w:eastAsia="Times New Roman"/>
-                <w:sz w:val="22"/>
-              </w:rPr>
+                <w:sz w:val="20"/>
+              </w:rPr>
+              <w:t>Màn đầu được mở sẵn; màn tiếp theo mở sau khi hoàn thành màn trước.</w:t>
             </w:r>
           </w:p>
         </w:tc>
@@ -456,8 +458,9 @@
             <w:r>
               <w:rPr>
                 <w:rFonts w:ascii="Times New Roman" w:hAnsi="Times New Roman" w:eastAsia="Times New Roman"/>
-                <w:sz w:val="22"/>
-              </w:rPr>
+                <w:sz w:val="20"/>
+              </w:rPr>
+              <w:t>Mỗi màn có tên, mô tả, sức chứa thuyền và điều kiện an toàn riêng.</w:t>
             </w:r>
           </w:p>
         </w:tc>
@@ -559,8 +562,9 @@
             <w:r>
               <w:rPr>
                 <w:rFonts w:ascii="Times New Roman" w:hAnsi="Times New Roman" w:eastAsia="Times New Roman"/>
-                <w:sz w:val="22"/>
-              </w:rPr>
+                <w:sz w:val="20"/>
+              </w:rPr>
+              <w:t>Nhấp vào nhân vật đang đứng cùng phía với thuyền để chọn hoặc bỏ chọn.</w:t>
             </w:r>
           </w:p>
         </w:tc>
@@ -662,8 +666,9 @@
             <w:r>
               <w:rPr>
                 <w:rFonts w:ascii="Times New Roman" w:hAnsi="Times New Roman" w:eastAsia="Times New Roman"/>
-                <w:sz w:val="22"/>
-              </w:rPr>
+                <w:sz w:val="20"/>
+              </w:rPr>
+              <w:t>Đưa các nhân vật đã chọn sang bờ đối diện khi nước đi hợp lệ.</w:t>
             </w:r>
           </w:p>
         </w:tc>
@@ -761,8 +766,9 @@
             <w:r>
               <w:rPr>
                 <w:rFonts w:ascii="Times New Roman" w:hAnsi="Times New Roman" w:eastAsia="Times New Roman"/>
-                <w:sz w:val="22"/>
-              </w:rPr>
+                <w:sz w:val="20"/>
+              </w:rPr>
+              <w:t>Không cho thuyền chở vượt quá sức chứa quy định của từng màn.</w:t>
             </w:r>
           </w:p>
         </w:tc>
@@ -860,8 +866,9 @@
             <w:r>
               <w:rPr>
                 <w:rFonts w:ascii="Times New Roman" w:hAnsi="Times New Roman" w:eastAsia="Times New Roman"/>
-                <w:sz w:val="22"/>
-              </w:rPr>
+                <w:sz w:val="20"/>
+              </w:rPr>
+              <w:t>Chỉ cho thuyền di chuyển khi có ít nhất một nhân vật biết chèo.</w:t>
             </w:r>
           </w:p>
         </w:tc>
@@ -959,8 +966,9 @@
             <w:r>
               <w:rPr>
                 <w:rFonts w:ascii="Times New Roman" w:hAnsi="Times New Roman" w:eastAsia="Times New Roman"/>
-                <w:sz w:val="22"/>
-              </w:rPr>
+                <w:sz w:val="20"/>
+              </w:rPr>
+              <w:t>Ngăn nước đi làm vi phạm quan hệ an toàn của nhân vật trên hai bờ.</w:t>
             </w:r>
           </w:p>
         </w:tc>
@@ -1058,8 +1066,9 @@
             <w:r>
               <w:rPr>
                 <w:rFonts w:ascii="Times New Roman" w:hAnsi="Times New Roman" w:eastAsia="Times New Roman"/>
-                <w:sz w:val="22"/>
-              </w:rPr>
+                <w:sz w:val="20"/>
+              </w:rPr>
+              <w:t>Hiển thị thông báo khi chưa chọn người, quá tải, thiếu người chèo hoặc sai luật.</w:t>
             </w:r>
           </w:p>
         </w:tc>
@@ -1157,8 +1166,9 @@
             <w:r>
               <w:rPr>
                 <w:rFonts w:ascii="Times New Roman" w:hAnsi="Times New Roman" w:eastAsia="Times New Roman"/>
-                <w:sz w:val="22"/>
-              </w:rPr>
+                <w:sz w:val="20"/>
+              </w:rPr>
+              <w:t>Dùng thuật toán BFS để tìm lời giải từ trạng thái hiện tại và chọn nước đi kế tiếp.</w:t>
             </w:r>
           </w:p>
         </w:tc>
@@ -1256,8 +1266,9 @@
             <w:r>
               <w:rPr>
                 <w:rFonts w:ascii="Times New Roman" w:hAnsi="Times New Roman" w:eastAsia="Times New Roman"/>
-                <w:sz w:val="22"/>
-              </w:rPr>
+                <w:sz w:val="20"/>
+              </w:rPr>
+              <w:t>Khôi phục vị trí nhân vật, vị trí thuyền và số lượt của bước trước đó.</w:t>
             </w:r>
           </w:p>
         </w:tc>
@@ -1355,8 +1366,9 @@
             <w:r>
               <w:rPr>
                 <w:rFonts w:ascii="Times New Roman" w:hAnsi="Times New Roman" w:eastAsia="Times New Roman"/>
-                <w:sz w:val="22"/>
-              </w:rPr>
+                <w:sz w:val="20"/>
+              </w:rPr>
+              <w:t>Đưa toàn bộ nhân vật và số lượt của màn hiện tại về trạng thái ban đầu.</w:t>
             </w:r>
           </w:p>
         </w:tc>
@@ -1454,8 +1466,9 @@
             <w:r>
               <w:rPr>
                 <w:rFonts w:ascii="Times New Roman" w:hAnsi="Times New Roman" w:eastAsia="Times New Roman"/>
-                <w:sz w:val="22"/>
-              </w:rPr>
+                <w:sz w:val="20"/>
+              </w:rPr>
+              <w:t>Đánh giá từ một đến ba sao dựa trên số chuyến so với mục tiêu của màn.</w:t>
             </w:r>
           </w:p>
         </w:tc>
@@ -1553,8 +1566,9 @@
             <w:r>
               <w:rPr>
                 <w:rFonts w:ascii="Times New Roman" w:hAnsi="Times New Roman" w:eastAsia="Times New Roman"/>
-                <w:sz w:val="22"/>
-              </w:rPr>
+                <w:sz w:val="20"/>
+              </w:rPr>
+              <w:t>Tự động lưu màn đã mở khóa và số lượt tốt nhất để sử dụng ở lần chơi sau.</w:t>
             </w:r>
           </w:p>
         </w:tc>
@@ -1652,8 +1666,9 @@
             <w:r>
               <w:rPr>
                 <w:rFonts w:ascii="Times New Roman" w:hAnsi="Times New Roman" w:eastAsia="Times New Roman"/>
-                <w:sz w:val="22"/>
-              </w:rPr>
+                <w:sz w:val="20"/>
+              </w:rPr>
+              <w:t>Bản Windows hỗ trợ chuột và phím tắt; bản Android hỗ trợ thao tác cảm ứng.</w:t>
             </w:r>
           </w:p>
         </w:tc>
@@ -1751,8 +1766,9 @@
             <w:r>
               <w:rPr>
                 <w:rFonts w:ascii="Times New Roman" w:hAnsi="Times New Roman" w:eastAsia="Times New Roman"/>
-                <w:sz w:val="22"/>
-              </w:rPr>
+                <w:sz w:val="20"/>
+              </w:rPr>
+              <w:t>Có bộ cài Windows kèm Java runtime và APK universal dành cho Android 6.0 trở lên.</w:t>
             </w:r>
           </w:p>
         </w:tc>

</xml_diff>